<commit_message>
Update README and add day 5, 6, 7 labs
</commit_message>
<xml_diff>
--- a/day6,7/Lab/Lab.docx
+++ b/day6,7/Lab/Lab.docx
@@ -1,15 +1,14 @@
 
 <file path=word/document.xml><?xml version="1.0" encoding="utf-8"?>
-<w:document xmlns:wpc="http://schemas.microsoft.com/office/word/2010/wordprocessingCanvas" xmlns:mc="http://schemas.openxmlformats.org/markup-compatibility/2006" xmlns:o="urn:schemas-microsoft-com:office:office" xmlns:r="http://schemas.openxmlformats.org/officeDocument/2006/relationships" xmlns:m="http://schemas.openxmlformats.org/officeDocument/2006/math" xmlns:v="urn:schemas-microsoft-com:vml" xmlns:wp14="http://schemas.microsoft.com/office/word/2010/wordprocessingDrawing" xmlns:wp="http://schemas.openxmlformats.org/drawingml/2006/wordprocessingDrawing" xmlns:w10="urn:schemas-microsoft-com:office:word" xmlns:w="http://schemas.openxmlformats.org/wordprocessingml/2006/main" xmlns:w14="http://schemas.microsoft.com/office/word/2010/wordml" xmlns:w15="http://schemas.microsoft.com/office/word/2012/wordml" xmlns:wpg="http://schemas.microsoft.com/office/word/2010/wordprocessingGroup" xmlns:wpi="http://schemas.microsoft.com/office/word/2010/wordprocessingInk" xmlns:wne="http://schemas.microsoft.com/office/word/2006/wordml" xmlns:wps="http://schemas.microsoft.com/office/word/2010/wordprocessingShape" mc:Ignorable="w14 w15 wp14">
+<w:document xmlns:wpc="http://schemas.microsoft.com/office/word/2010/wordprocessingCanvas" xmlns:cx="http://schemas.microsoft.com/office/drawing/2014/chartex" xmlns:cx1="http://schemas.microsoft.com/office/drawing/2015/9/8/chartex" xmlns:cx2="http://schemas.microsoft.com/office/drawing/2015/10/21/chartex" xmlns:cx3="http://schemas.microsoft.com/office/drawing/2016/5/9/chartex" xmlns:cx4="http://schemas.microsoft.com/office/drawing/2016/5/10/chartex" xmlns:cx5="http://schemas.microsoft.com/office/drawing/2016/5/11/chartex" xmlns:cx6="http://schemas.microsoft.com/office/drawing/2016/5/12/chartex" xmlns:cx7="http://schemas.microsoft.com/office/drawing/2016/5/13/chartex" xmlns:cx8="http://schemas.microsoft.com/office/drawing/2016/5/14/chartex" xmlns:mc="http://schemas.openxmlformats.org/markup-compatibility/2006" xmlns:aink="http://schemas.microsoft.com/office/drawing/2016/ink" xmlns:am3d="http://schemas.microsoft.com/office/drawing/2017/model3d" xmlns:o="urn:schemas-microsoft-com:office:office" xmlns:oel="http://schemas.microsoft.com/office/2019/extlst" xmlns:r="http://schemas.openxmlformats.org/officeDocument/2006/relationships" xmlns:m="http://schemas.openxmlformats.org/officeDocument/2006/math" xmlns:v="urn:schemas-microsoft-com:vml" xmlns:wp14="http://schemas.microsoft.com/office/word/2010/wordprocessingDrawing" xmlns:wp="http://schemas.openxmlformats.org/drawingml/2006/wordprocessingDrawing" xmlns:w10="urn:schemas-microsoft-com:office:word" xmlns:w="http://schemas.openxmlformats.org/wordprocessingml/2006/main" xmlns:w14="http://schemas.microsoft.com/office/word/2010/wordml" xmlns:w15="http://schemas.microsoft.com/office/word/2012/wordml" xmlns:w16cei="http://schemas.microsoft.com/office/word/2026/wordml/cei" xmlns:w16cex="http://schemas.microsoft.com/office/word/2018/wordml/cex" xmlns:w16cid="http://schemas.microsoft.com/office/word/2016/wordml/cid" xmlns:w16="http://schemas.microsoft.com/office/word/2018/wordml" xmlns:w16du="http://schemas.microsoft.com/office/word/2023/wordml/word16du" xmlns:w16sdtdh="http://schemas.microsoft.com/office/word/2020/wordml/sdtdatahash" xmlns:w16sdtfl="http://schemas.microsoft.com/office/word/2024/wordml/sdtformatlock" xmlns:w16se="http://schemas.microsoft.com/office/word/2015/wordml/symex" xmlns:wpg="http://schemas.microsoft.com/office/word/2010/wordprocessingGroup" xmlns:wpi="http://schemas.microsoft.com/office/word/2010/wordprocessingInk" xmlns:wne="http://schemas.microsoft.com/office/word/2006/wordml" xmlns:wps="http://schemas.microsoft.com/office/word/2010/wordprocessingShape" mc:Ignorable="w14 w15 w16se w16cid w16 w16cex w16sdtdh w16sdtfl w16du wp14">
   <w:body>
-    <w:p xmlns:wp14="http://schemas.microsoft.com/office/word/2010/wordml" wp14:paraId="2C078E63" wp14:textId="43749B97">
+    <w:p>
       <w:r>
-        <w:rPr/>
         <w:t>https://mobirise.com/extensions/consultingamp/insurance/</w:t>
       </w:r>
     </w:p>
     <w:sectPr>
-      <w:pgSz w:w="12240" w:h="15840" w:orient="portrait"/>
+      <w:pgSz w:w="12240" w:h="15840"/>
       <w:pgMar w:top="1440" w:right="1440" w:bottom="1440" w:left="1440" w:header="720" w:footer="720" w:gutter="0"/>
       <w:cols w:space="720"/>
       <w:docGrid w:linePitch="360"/>
@@ -18,12 +17,62 @@
 </w:document>
 </file>
 
+<file path=word/endnotes.xml><?xml version="1.0" encoding="utf-8"?>
+<w:endnotes xmlns:wpc="http://schemas.microsoft.com/office/word/2010/wordprocessingCanvas" xmlns:cx="http://schemas.microsoft.com/office/drawing/2014/chartex" xmlns:cx1="http://schemas.microsoft.com/office/drawing/2015/9/8/chartex" xmlns:cx2="http://schemas.microsoft.com/office/drawing/2015/10/21/chartex" xmlns:cx3="http://schemas.microsoft.com/office/drawing/2016/5/9/chartex" xmlns:cx4="http://schemas.microsoft.com/office/drawing/2016/5/10/chartex" xmlns:cx5="http://schemas.microsoft.com/office/drawing/2016/5/11/chartex" xmlns:cx6="http://schemas.microsoft.com/office/drawing/2016/5/12/chartex" xmlns:cx7="http://schemas.microsoft.com/office/drawing/2016/5/13/chartex" xmlns:cx8="http://schemas.microsoft.com/office/drawing/2016/5/14/chartex" xmlns:mc="http://schemas.openxmlformats.org/markup-compatibility/2006" xmlns:aink="http://schemas.microsoft.com/office/drawing/2016/ink" xmlns:am3d="http://schemas.microsoft.com/office/drawing/2017/model3d" xmlns:o="urn:schemas-microsoft-com:office:office" xmlns:oel="http://schemas.microsoft.com/office/2019/extlst" xmlns:r="http://schemas.openxmlformats.org/officeDocument/2006/relationships" xmlns:m="http://schemas.openxmlformats.org/officeDocument/2006/math" xmlns:v="urn:schemas-microsoft-com:vml" xmlns:wp14="http://schemas.microsoft.com/office/word/2010/wordprocessingDrawing" xmlns:wp="http://schemas.openxmlformats.org/drawingml/2006/wordprocessingDrawing" xmlns:w10="urn:schemas-microsoft-com:office:word" xmlns:w="http://schemas.openxmlformats.org/wordprocessingml/2006/main" xmlns:w14="http://schemas.microsoft.com/office/word/2010/wordml" xmlns:w15="http://schemas.microsoft.com/office/word/2012/wordml" xmlns:w16cei="http://schemas.microsoft.com/office/word/2026/wordml/cei" xmlns:w16cex="http://schemas.microsoft.com/office/word/2018/wordml/cex" xmlns:w16cid="http://schemas.microsoft.com/office/word/2016/wordml/cid" xmlns:w16="http://schemas.microsoft.com/office/word/2018/wordml" xmlns:w16du="http://schemas.microsoft.com/office/word/2023/wordml/word16du" xmlns:w16sdtdh="http://schemas.microsoft.com/office/word/2020/wordml/sdtdatahash" xmlns:w16sdtfl="http://schemas.microsoft.com/office/word/2024/wordml/sdtformatlock" xmlns:w16se="http://schemas.microsoft.com/office/word/2015/wordml/symex" xmlns:wpg="http://schemas.microsoft.com/office/word/2010/wordprocessingGroup" xmlns:wpi="http://schemas.microsoft.com/office/word/2010/wordprocessingInk" xmlns:wne="http://schemas.microsoft.com/office/word/2006/wordml" xmlns:wps="http://schemas.microsoft.com/office/word/2010/wordprocessingShape" mc:Ignorable="w14 w15 w16se w16cid w16 w16cex w16sdtdh w16sdtfl w16du wp14">
+  <w:endnote w:type="separator" w:id="-1">
+    <w:p>
+      <w:pPr>
+        <w:spacing w:after="0" w:line="240" w:lineRule="auto"/>
+      </w:pPr>
+      <w:r>
+        <w:separator/>
+      </w:r>
+    </w:p>
+  </w:endnote>
+  <w:endnote w:type="continuationSeparator" w:id="0">
+    <w:p>
+      <w:pPr>
+        <w:spacing w:after="0" w:line="240" w:lineRule="auto"/>
+      </w:pPr>
+      <w:r>
+        <w:continuationSeparator/>
+      </w:r>
+    </w:p>
+  </w:endnote>
+</w:endnotes>
+</file>
+
+<file path=word/footnotes.xml><?xml version="1.0" encoding="utf-8"?>
+<w:footnotes xmlns:wpc="http://schemas.microsoft.com/office/word/2010/wordprocessingCanvas" xmlns:cx="http://schemas.microsoft.com/office/drawing/2014/chartex" xmlns:cx1="http://schemas.microsoft.com/office/drawing/2015/9/8/chartex" xmlns:cx2="http://schemas.microsoft.com/office/drawing/2015/10/21/chartex" xmlns:cx3="http://schemas.microsoft.com/office/drawing/2016/5/9/chartex" xmlns:cx4="http://schemas.microsoft.com/office/drawing/2016/5/10/chartex" xmlns:cx5="http://schemas.microsoft.com/office/drawing/2016/5/11/chartex" xmlns:cx6="http://schemas.microsoft.com/office/drawing/2016/5/12/chartex" xmlns:cx7="http://schemas.microsoft.com/office/drawing/2016/5/13/chartex" xmlns:cx8="http://schemas.microsoft.com/office/drawing/2016/5/14/chartex" xmlns:mc="http://schemas.openxmlformats.org/markup-compatibility/2006" xmlns:aink="http://schemas.microsoft.com/office/drawing/2016/ink" xmlns:am3d="http://schemas.microsoft.com/office/drawing/2017/model3d" xmlns:o="urn:schemas-microsoft-com:office:office" xmlns:oel="http://schemas.microsoft.com/office/2019/extlst" xmlns:r="http://schemas.openxmlformats.org/officeDocument/2006/relationships" xmlns:m="http://schemas.openxmlformats.org/officeDocument/2006/math" xmlns:v="urn:schemas-microsoft-com:vml" xmlns:wp14="http://schemas.microsoft.com/office/word/2010/wordprocessingDrawing" xmlns:wp="http://schemas.openxmlformats.org/drawingml/2006/wordprocessingDrawing" xmlns:w10="urn:schemas-microsoft-com:office:word" xmlns:w="http://schemas.openxmlformats.org/wordprocessingml/2006/main" xmlns:w14="http://schemas.microsoft.com/office/word/2010/wordml" xmlns:w15="http://schemas.microsoft.com/office/word/2012/wordml" xmlns:w16cei="http://schemas.microsoft.com/office/word/2026/wordml/cei" xmlns:w16cex="http://schemas.microsoft.com/office/word/2018/wordml/cex" xmlns:w16cid="http://schemas.microsoft.com/office/word/2016/wordml/cid" xmlns:w16="http://schemas.microsoft.com/office/word/2018/wordml" xmlns:w16du="http://schemas.microsoft.com/office/word/2023/wordml/word16du" xmlns:w16sdtdh="http://schemas.microsoft.com/office/word/2020/wordml/sdtdatahash" xmlns:w16sdtfl="http://schemas.microsoft.com/office/word/2024/wordml/sdtformatlock" xmlns:w16se="http://schemas.microsoft.com/office/word/2015/wordml/symex" xmlns:wpg="http://schemas.microsoft.com/office/word/2010/wordprocessingGroup" xmlns:wpi="http://schemas.microsoft.com/office/word/2010/wordprocessingInk" xmlns:wne="http://schemas.microsoft.com/office/word/2006/wordml" xmlns:wps="http://schemas.microsoft.com/office/word/2010/wordprocessingShape" mc:Ignorable="w14 w15 w16se w16cid w16 w16cex w16sdtdh w16sdtfl w16du wp14">
+  <w:footnote w:type="separator" w:id="-1">
+    <w:p>
+      <w:pPr>
+        <w:spacing w:after="0" w:line="240" w:lineRule="auto"/>
+      </w:pPr>
+      <w:r>
+        <w:separator/>
+      </w:r>
+    </w:p>
+  </w:footnote>
+  <w:footnote w:type="continuationSeparator" w:id="0">
+    <w:p>
+      <w:pPr>
+        <w:spacing w:after="0" w:line="240" w:lineRule="auto"/>
+      </w:pPr>
+      <w:r>
+        <w:continuationSeparator/>
+      </w:r>
+    </w:p>
+  </w:footnote>
+</w:footnotes>
+</file>
+
 <file path=word/styles.xml><?xml version="1.0" encoding="utf-8"?>
-<w:styles xmlns:wp14="http://schemas.microsoft.com/office/word/2010/wordprocessingDrawing" xmlns:mc="http://schemas.openxmlformats.org/markup-compatibility/2006" xmlns:r="http://schemas.openxmlformats.org/officeDocument/2006/relationships" xmlns:w="http://schemas.openxmlformats.org/wordprocessingml/2006/main" xmlns:w14="http://schemas.microsoft.com/office/word/2010/wordml" xmlns:w15="http://schemas.microsoft.com/office/word/2012/wordml" mc:Ignorable="w14 w15 wp14">
+<w:styles xmlns:mc="http://schemas.openxmlformats.org/markup-compatibility/2006" xmlns:r="http://schemas.openxmlformats.org/officeDocument/2006/relationships" xmlns:w="http://schemas.openxmlformats.org/wordprocessingml/2006/main" xmlns:w14="http://schemas.microsoft.com/office/word/2010/wordml" xmlns:w15="http://schemas.microsoft.com/office/word/2012/wordml" xmlns:w16cex="http://schemas.microsoft.com/office/word/2018/wordml/cex" xmlns:w16cid="http://schemas.microsoft.com/office/word/2016/wordml/cid" xmlns:w16="http://schemas.microsoft.com/office/word/2018/wordml" xmlns:w16du="http://schemas.microsoft.com/office/word/2023/wordml/word16du" xmlns:w16sdtdh="http://schemas.microsoft.com/office/word/2020/wordml/sdtdatahash" xmlns:w16sdtfl="http://schemas.microsoft.com/office/word/2024/wordml/sdtformatlock" xmlns:w16se="http://schemas.microsoft.com/office/word/2015/wordml/symex" mc:Ignorable="w14 w15 w16se w16cid w16 w16cex w16sdtdh w16sdtfl w16du">
   <w:docDefaults>
     <w:rPrDefault>
       <w:rPr>
-        <w:rFonts w:asciiTheme="minorHAnsi" w:hAnsiTheme="minorHAnsi" w:eastAsiaTheme="minorHAnsi" w:cstheme="minorBidi"/>
+        <w:rFonts w:asciiTheme="minorHAnsi" w:eastAsiaTheme="minorHAnsi" w:hAnsiTheme="minorHAnsi" w:cstheme="minorBidi"/>
         <w:sz w:val="22"/>
         <w:szCs w:val="22"/>
         <w:lang w:val="en-US" w:eastAsia="en-US" w:bidi="ar-SA"/>
@@ -35,17 +84,17 @@
       </w:pPr>
     </w:pPrDefault>
   </w:docDefaults>
-  <w:latentStyles w:defLockedState="0" w:defUIPriority="99" w:defSemiHidden="0" w:defUnhideWhenUsed="0" w:defQFormat="0" w:count="371">
+  <w:latentStyles w:defLockedState="0" w:defUIPriority="99" w:defSemiHidden="0" w:defUnhideWhenUsed="0" w:defQFormat="0" w:count="376">
     <w:lsdException w:name="Normal" w:uiPriority="0" w:qFormat="1"/>
     <w:lsdException w:name="heading 1" w:uiPriority="9" w:qFormat="1"/>
-    <w:lsdException w:name="heading 2" w:uiPriority="9" w:semiHidden="1" w:unhideWhenUsed="1" w:qFormat="1"/>
-    <w:lsdException w:name="heading 3" w:uiPriority="9" w:semiHidden="1" w:unhideWhenUsed="1" w:qFormat="1"/>
-    <w:lsdException w:name="heading 4" w:uiPriority="9" w:semiHidden="1" w:unhideWhenUsed="1" w:qFormat="1"/>
-    <w:lsdException w:name="heading 5" w:uiPriority="9" w:semiHidden="1" w:unhideWhenUsed="1" w:qFormat="1"/>
-    <w:lsdException w:name="heading 6" w:uiPriority="9" w:semiHidden="1" w:unhideWhenUsed="1" w:qFormat="1"/>
-    <w:lsdException w:name="heading 7" w:uiPriority="9" w:semiHidden="1" w:unhideWhenUsed="1" w:qFormat="1"/>
-    <w:lsdException w:name="heading 8" w:uiPriority="9" w:semiHidden="1" w:unhideWhenUsed="1" w:qFormat="1"/>
-    <w:lsdException w:name="heading 9" w:uiPriority="9" w:semiHidden="1" w:unhideWhenUsed="1" w:qFormat="1"/>
+    <w:lsdException w:name="heading 2" w:semiHidden="1" w:uiPriority="9" w:unhideWhenUsed="1" w:qFormat="1"/>
+    <w:lsdException w:name="heading 3" w:semiHidden="1" w:uiPriority="9" w:unhideWhenUsed="1" w:qFormat="1"/>
+    <w:lsdException w:name="heading 4" w:semiHidden="1" w:uiPriority="9" w:unhideWhenUsed="1" w:qFormat="1"/>
+    <w:lsdException w:name="heading 5" w:semiHidden="1" w:uiPriority="9" w:unhideWhenUsed="1" w:qFormat="1"/>
+    <w:lsdException w:name="heading 6" w:semiHidden="1" w:uiPriority="9" w:unhideWhenUsed="1" w:qFormat="1"/>
+    <w:lsdException w:name="heading 7" w:semiHidden="1" w:uiPriority="9" w:unhideWhenUsed="1" w:qFormat="1"/>
+    <w:lsdException w:name="heading 8" w:semiHidden="1" w:uiPriority="9" w:unhideWhenUsed="1" w:qFormat="1"/>
+    <w:lsdException w:name="heading 9" w:semiHidden="1" w:uiPriority="9" w:unhideWhenUsed="1" w:qFormat="1"/>
     <w:lsdException w:name="index 1" w:semiHidden="1" w:unhideWhenUsed="1"/>
     <w:lsdException w:name="index 2" w:semiHidden="1" w:unhideWhenUsed="1"/>
     <w:lsdException w:name="index 3" w:semiHidden="1" w:unhideWhenUsed="1"/>
@@ -55,22 +104,22 @@
     <w:lsdException w:name="index 7" w:semiHidden="1" w:unhideWhenUsed="1"/>
     <w:lsdException w:name="index 8" w:semiHidden="1" w:unhideWhenUsed="1"/>
     <w:lsdException w:name="index 9" w:semiHidden="1" w:unhideWhenUsed="1"/>
-    <w:lsdException w:name="toc 1" w:uiPriority="39" w:semiHidden="1" w:unhideWhenUsed="1"/>
-    <w:lsdException w:name="toc 2" w:uiPriority="39" w:semiHidden="1" w:unhideWhenUsed="1"/>
-    <w:lsdException w:name="toc 3" w:uiPriority="39" w:semiHidden="1" w:unhideWhenUsed="1"/>
-    <w:lsdException w:name="toc 4" w:uiPriority="39" w:semiHidden="1" w:unhideWhenUsed="1"/>
-    <w:lsdException w:name="toc 5" w:uiPriority="39" w:semiHidden="1" w:unhideWhenUsed="1"/>
-    <w:lsdException w:name="toc 6" w:uiPriority="39" w:semiHidden="1" w:unhideWhenUsed="1"/>
-    <w:lsdException w:name="toc 7" w:uiPriority="39" w:semiHidden="1" w:unhideWhenUsed="1"/>
-    <w:lsdException w:name="toc 8" w:uiPriority="39" w:semiHidden="1" w:unhideWhenUsed="1"/>
-    <w:lsdException w:name="toc 9" w:uiPriority="39" w:semiHidden="1" w:unhideWhenUsed="1"/>
+    <w:lsdException w:name="toc 1" w:semiHidden="1" w:uiPriority="39" w:unhideWhenUsed="1"/>
+    <w:lsdException w:name="toc 2" w:semiHidden="1" w:uiPriority="39" w:unhideWhenUsed="1"/>
+    <w:lsdException w:name="toc 3" w:semiHidden="1" w:uiPriority="39" w:unhideWhenUsed="1"/>
+    <w:lsdException w:name="toc 4" w:semiHidden="1" w:uiPriority="39" w:unhideWhenUsed="1"/>
+    <w:lsdException w:name="toc 5" w:semiHidden="1" w:uiPriority="39" w:unhideWhenUsed="1"/>
+    <w:lsdException w:name="toc 6" w:semiHidden="1" w:uiPriority="39" w:unhideWhenUsed="1"/>
+    <w:lsdException w:name="toc 7" w:semiHidden="1" w:uiPriority="39" w:unhideWhenUsed="1"/>
+    <w:lsdException w:name="toc 8" w:semiHidden="1" w:uiPriority="39" w:unhideWhenUsed="1"/>
+    <w:lsdException w:name="toc 9" w:semiHidden="1" w:uiPriority="39" w:unhideWhenUsed="1"/>
     <w:lsdException w:name="Normal Indent" w:semiHidden="1" w:unhideWhenUsed="1"/>
     <w:lsdException w:name="footnote text" w:semiHidden="1" w:unhideWhenUsed="1"/>
     <w:lsdException w:name="annotation text" w:semiHidden="1" w:unhideWhenUsed="1"/>
     <w:lsdException w:name="header" w:semiHidden="1" w:unhideWhenUsed="1"/>
     <w:lsdException w:name="footer" w:semiHidden="1" w:unhideWhenUsed="1"/>
     <w:lsdException w:name="index heading" w:semiHidden="1" w:unhideWhenUsed="1"/>
-    <w:lsdException w:name="caption" w:uiPriority="35" w:semiHidden="1" w:unhideWhenUsed="1" w:qFormat="1"/>
+    <w:lsdException w:name="caption" w:semiHidden="1" w:uiPriority="35" w:unhideWhenUsed="1" w:qFormat="1"/>
     <w:lsdException w:name="table of figures" w:semiHidden="1" w:unhideWhenUsed="1"/>
     <w:lsdException w:name="envelope address" w:semiHidden="1" w:unhideWhenUsed="1"/>
     <w:lsdException w:name="envelope return" w:semiHidden="1" w:unhideWhenUsed="1"/>
@@ -101,7 +150,7 @@
     <w:lsdException w:name="Title" w:uiPriority="10" w:qFormat="1"/>
     <w:lsdException w:name="Closing" w:semiHidden="1" w:unhideWhenUsed="1"/>
     <w:lsdException w:name="Signature" w:semiHidden="1" w:unhideWhenUsed="1"/>
-    <w:lsdException w:name="Default Paragraph Font" w:uiPriority="1" w:semiHidden="1" w:unhideWhenUsed="1"/>
+    <w:lsdException w:name="Default Paragraph Font" w:semiHidden="1" w:uiPriority="1" w:unhideWhenUsed="1"/>
     <w:lsdException w:name="Body Text" w:semiHidden="1" w:unhideWhenUsed="1"/>
     <w:lsdException w:name="Body Text Indent" w:semiHidden="1" w:unhideWhenUsed="1"/>
     <w:lsdException w:name="List Continue" w:semiHidden="1" w:unhideWhenUsed="1"/>
@@ -301,8 +350,8 @@
     <w:lsdException w:name="Subtle Reference" w:uiPriority="31" w:qFormat="1"/>
     <w:lsdException w:name="Intense Reference" w:uiPriority="32" w:qFormat="1"/>
     <w:lsdException w:name="Book Title" w:uiPriority="33" w:qFormat="1"/>
-    <w:lsdException w:name="Bibliography" w:uiPriority="37" w:semiHidden="1" w:unhideWhenUsed="1"/>
-    <w:lsdException w:name="TOC Heading" w:uiPriority="39" w:semiHidden="1" w:unhideWhenUsed="1" w:qFormat="1"/>
+    <w:lsdException w:name="Bibliography" w:semiHidden="1" w:uiPriority="37" w:unhideWhenUsed="1"/>
+    <w:lsdException w:name="TOC Heading" w:semiHidden="1" w:uiPriority="39" w:unhideWhenUsed="1" w:qFormat="1"/>
     <w:lsdException w:name="Plain Table 1" w:uiPriority="41"/>
     <w:lsdException w:name="Plain Table 2" w:uiPriority="42"/>
     <w:lsdException w:name="Plain Table 3" w:uiPriority="43"/>
@@ -407,18 +456,23 @@
     <w:lsdException w:name="List Table 5 Dark Accent 6" w:uiPriority="50"/>
     <w:lsdException w:name="List Table 6 Colorful Accent 6" w:uiPriority="51"/>
     <w:lsdException w:name="List Table 7 Colorful Accent 6" w:uiPriority="52"/>
+    <w:lsdException w:name="Mention" w:semiHidden="1" w:unhideWhenUsed="1"/>
+    <w:lsdException w:name="Smart Hyperlink" w:semiHidden="1" w:unhideWhenUsed="1"/>
+    <w:lsdException w:name="Hashtag" w:semiHidden="1" w:unhideWhenUsed="1"/>
+    <w:lsdException w:name="Unresolved Mention" w:semiHidden="1" w:unhideWhenUsed="1"/>
+    <w:lsdException w:name="Smart Link" w:semiHidden="1" w:unhideWhenUsed="1"/>
   </w:latentStyles>
-  <w:style w:type="paragraph" w:styleId="Normal" w:default="1">
+  <w:style w:type="paragraph" w:default="1" w:styleId="Normal">
     <w:name w:val="Normal"/>
     <w:qFormat/>
   </w:style>
-  <w:style w:type="character" w:styleId="DefaultParagraphFont" w:default="1">
+  <w:style w:type="character" w:default="1" w:styleId="DefaultParagraphFont">
     <w:name w:val="Default Paragraph Font"/>
     <w:uiPriority w:val="1"/>
     <w:semiHidden/>
     <w:unhideWhenUsed/>
   </w:style>
-  <w:style w:type="table" w:styleId="TableNormal" w:default="1">
+  <w:style w:type="table" w:default="1" w:styleId="TableNormal">
     <w:name w:val="Normal Table"/>
     <w:uiPriority w:val="99"/>
     <w:semiHidden/>
@@ -433,11 +487,55 @@
       </w:tblCellMar>
     </w:tblPr>
   </w:style>
-  <w:style w:type="numbering" w:styleId="NoList" w:default="1">
+  <w:style w:type="numbering" w:default="1" w:styleId="NoList">
     <w:name w:val="No List"/>
     <w:uiPriority w:val="99"/>
     <w:semiHidden/>
     <w:unhideWhenUsed/>
+  </w:style>
+  <w:style w:type="paragraph" w:styleId="Header">
+    <w:name w:val="header"/>
+    <w:basedOn w:val="Normal"/>
+    <w:link w:val="HeaderChar"/>
+    <w:uiPriority w:val="99"/>
+    <w:unhideWhenUsed/>
+    <w:rsid w:val="0087646B"/>
+    <w:pPr>
+      <w:tabs>
+        <w:tab w:val="center" w:pos="4680"/>
+        <w:tab w:val="right" w:pos="9360"/>
+      </w:tabs>
+      <w:spacing w:after="0" w:line="240" w:lineRule="auto"/>
+    </w:pPr>
+  </w:style>
+  <w:style w:type="character" w:customStyle="1" w:styleId="HeaderChar">
+    <w:name w:val="Header Char"/>
+    <w:basedOn w:val="DefaultParagraphFont"/>
+    <w:link w:val="Header"/>
+    <w:uiPriority w:val="99"/>
+    <w:rsid w:val="0087646B"/>
+  </w:style>
+  <w:style w:type="paragraph" w:styleId="Footer">
+    <w:name w:val="footer"/>
+    <w:basedOn w:val="Normal"/>
+    <w:link w:val="FooterChar"/>
+    <w:uiPriority w:val="99"/>
+    <w:unhideWhenUsed/>
+    <w:rsid w:val="0087646B"/>
+    <w:pPr>
+      <w:tabs>
+        <w:tab w:val="center" w:pos="4680"/>
+        <w:tab w:val="right" w:pos="9360"/>
+      </w:tabs>
+      <w:spacing w:after="0" w:line="240" w:lineRule="auto"/>
+    </w:pPr>
+  </w:style>
+  <w:style w:type="character" w:customStyle="1" w:styleId="FooterChar">
+    <w:name w:val="Footer Char"/>
+    <w:basedOn w:val="DefaultParagraphFont"/>
+    <w:link w:val="Footer"/>
+    <w:uiPriority w:val="99"/>
+    <w:rsid w:val="0087646B"/>
   </w:style>
 </w:styles>
 </file>
@@ -704,6 +802,15 @@
 </file>
 
 <file path=customXml/item1.xml><?xml version="1.0" encoding="utf-8"?>
+<?mso-contentType ?>
+<FormTemplates xmlns="http://schemas.microsoft.com/sharepoint/v3/contenttype/forms">
+  <Display>DocumentLibraryForm</Display>
+  <Edit>DocumentLibraryForm</Edit>
+  <New>DocumentLibraryForm</New>
+</FormTemplates>
+</file>
+
+<file path=customXml/item2.xml><?xml version="1.0" encoding="utf-8"?>
 <ct:contentTypeSchema xmlns:ct="http://schemas.microsoft.com/office/2006/metadata/contentType" xmlns:ma="http://schemas.microsoft.com/office/2006/metadata/properties/metaAttributes" ct:_="" ma:_="" ma:contentTypeName="Document" ma:contentTypeID="0x010100BFAE4C4804CB664FAAC122281042BD36" ma:contentTypeVersion="11" ma:contentTypeDescription="Create a new document." ma:contentTypeScope="" ma:versionID="8d338763a3fc873bed72073809246629">
   <xsd:schema xmlns:xsd="http://www.w3.org/2001/XMLSchema" xmlns:xs="http://www.w3.org/2001/XMLSchema" xmlns:p="http://schemas.microsoft.com/office/2006/metadata/properties" xmlns:ns2="e2be205d-0d52-4db5-8c3b-46e3533b8ad7" xmlns:ns3="a7154ad6-fc56-4450-b79f-d459944c2326" targetNamespace="http://schemas.microsoft.com/office/2006/metadata/properties" ma:root="true" ma:fieldsID="94e285e18c97061341c865c05f8e0665" ns2:_="" ns3:_="">
     <xsd:import namespace="e2be205d-0d52-4db5-8c3b-46e3533b8ad7"/>
@@ -898,15 +1005,6 @@
 </ct:contentTypeSchema>
 </file>
 
-<file path=customXml/item2.xml><?xml version="1.0" encoding="utf-8"?>
-<?mso-contentType ?>
-<FormTemplates xmlns="http://schemas.microsoft.com/sharepoint/v3/contenttype/forms">
-  <Display>DocumentLibraryForm</Display>
-  <Edit>DocumentLibraryForm</Edit>
-  <New>DocumentLibraryForm</New>
-</FormTemplates>
-</file>
-
 <file path=customXml/item3.xml><?xml version="1.0" encoding="utf-8"?>
 <p:properties xmlns:p="http://schemas.microsoft.com/office/2006/metadata/properties" xmlns:xsi="http://www.w3.org/2001/XMLSchema-instance" xmlns:pc="http://schemas.microsoft.com/office/infopath/2007/PartnerControls">
   <documentManagement>
@@ -919,13 +1017,39 @@
 </file>
 
 <file path=customXml/itemProps1.xml><?xml version="1.0" encoding="utf-8"?>
-<ds:datastoreItem xmlns:ds="http://schemas.openxmlformats.org/officeDocument/2006/customXml" ds:itemID="{843B7D2D-5D0F-412F-BE18-C4A517D05433}"/>
+<ds:datastoreItem xmlns:ds="http://schemas.openxmlformats.org/officeDocument/2006/customXml" ds:itemID="{BB9C4E81-1976-4F0E-8EEF-BE893061FF63}">
+  <ds:schemaRefs>
+    <ds:schemaRef ds:uri="http://schemas.microsoft.com/sharepoint/v3/contenttype/forms"/>
+  </ds:schemaRefs>
+</ds:datastoreItem>
 </file>
 
 <file path=customXml/itemProps2.xml><?xml version="1.0" encoding="utf-8"?>
-<ds:datastoreItem xmlns:ds="http://schemas.openxmlformats.org/officeDocument/2006/customXml" ds:itemID="{BB9C4E81-1976-4F0E-8EEF-BE893061FF63}"/>
+<ds:datastoreItem xmlns:ds="http://schemas.openxmlformats.org/officeDocument/2006/customXml" ds:itemID="{843B7D2D-5D0F-412F-BE18-C4A517D05433}">
+  <ds:schemaRefs>
+    <ds:schemaRef ds:uri="http://schemas.microsoft.com/office/2006/metadata/contentType"/>
+    <ds:schemaRef ds:uri="http://schemas.microsoft.com/office/2006/metadata/properties/metaAttributes"/>
+    <ds:schemaRef ds:uri="http://www.w3.org/2001/XMLSchema"/>
+    <ds:schemaRef ds:uri="http://schemas.microsoft.com/office/2006/metadata/properties"/>
+    <ds:schemaRef ds:uri="e2be205d-0d52-4db5-8c3b-46e3533b8ad7"/>
+    <ds:schemaRef ds:uri="a7154ad6-fc56-4450-b79f-d459944c2326"/>
+    <ds:schemaRef ds:uri="http://schemas.microsoft.com/office/2006/documentManagement/types"/>
+    <ds:schemaRef ds:uri="http://schemas.microsoft.com/office/infopath/2007/PartnerControls"/>
+    <ds:schemaRef ds:uri="http://schemas.openxmlformats.org/package/2006/metadata/core-properties"/>
+    <ds:schemaRef ds:uri="http://purl.org/dc/elements/1.1/"/>
+    <ds:schemaRef ds:uri="http://purl.org/dc/terms/"/>
+    <ds:schemaRef ds:uri="http://schemas.microsoft.com/internal/obd"/>
+  </ds:schemaRefs>
+</ds:datastoreItem>
 </file>
 
 <file path=customXml/itemProps3.xml><?xml version="1.0" encoding="utf-8"?>
-<ds:datastoreItem xmlns:ds="http://schemas.openxmlformats.org/officeDocument/2006/customXml" ds:itemID="{F29ADD68-E3CA-4E45-8340-C1C5C0696B0F}"/>
+<ds:datastoreItem xmlns:ds="http://schemas.openxmlformats.org/officeDocument/2006/customXml" ds:itemID="{F29ADD68-E3CA-4E45-8340-C1C5C0696B0F}">
+  <ds:schemaRefs>
+    <ds:schemaRef ds:uri="http://schemas.microsoft.com/office/2006/metadata/properties"/>
+    <ds:schemaRef ds:uri="http://schemas.microsoft.com/office/infopath/2007/PartnerControls"/>
+    <ds:schemaRef ds:uri="a7154ad6-fc56-4450-b79f-d459944c2326"/>
+    <ds:schemaRef ds:uri="e2be205d-0d52-4db5-8c3b-46e3533b8ad7"/>
+  </ds:schemaRefs>
+</ds:datastoreItem>
 </file>
</xml_diff>